<commit_message>
doc: update docs plan and laporan
</commit_message>
<xml_diff>
--- a/laporan/LAPORAN TUGAS PROYEK KELOMPOK 2.docx
+++ b/laporan/LAPORAN TUGAS PROYEK KELOMPOK 2.docx
@@ -53,12 +53,12 @@
           <wp:inline distB="0" distT="0" distL="0" distR="0">
             <wp:extent cx="2092162" cy="1974478"/>
             <wp:effectExtent b="0" l="0" r="0" t="0"/>
-            <wp:docPr descr="logo%20stt" id="46" name="image41.png"/>
+            <wp:docPr descr="logo%20stt" id="48" name="image43.png"/>
             <a:graphic>
               <a:graphicData uri="http://schemas.openxmlformats.org/drawingml/2006/picture">
                 <pic:pic>
                   <pic:nvPicPr>
-                    <pic:cNvPr descr="logo%20stt" id="0" name="image41.png"/>
+                    <pic:cNvPr descr="logo%20stt" id="0" name="image43.png"/>
                     <pic:cNvPicPr preferRelativeResize="0"/>
                   </pic:nvPicPr>
                   <pic:blipFill>
@@ -201,7 +201,6 @@
         </w:rPr>
         <w:t xml:space="preserve">Muhammad Hisyam Alfaris</w:t>
         <w:tab/>
-        <w:tab/>
         <w:t xml:space="preserve">0110224006</w:t>
       </w:r>
     </w:p>
@@ -396,7 +395,7 @@
     </w:p>
     <w:sdt>
       <w:sdtPr>
-        <w:id w:val="461726502"/>
+        <w:id w:val="2087584318"/>
         <w:docPartObj>
           <w:docPartGallery w:val="Table of Contents"/>
           <w:docPartUnique w:val="1"/>
@@ -5253,12 +5252,12 @@
             <wp:extent cx="5754688" cy="4399581"/>
             <wp:effectExtent b="0" l="0" r="0" t="0"/>
             <wp:wrapTopAndBottom distB="114300" distT="114300"/>
-            <wp:docPr id="37" name="image28.png"/>
+            <wp:docPr id="37" name="image36.png"/>
             <a:graphic>
               <a:graphicData uri="http://schemas.openxmlformats.org/drawingml/2006/picture">
                 <pic:pic>
                   <pic:nvPicPr>
-                    <pic:cNvPr id="0" name="image28.png"/>
+                    <pic:cNvPr id="0" name="image36.png"/>
                     <pic:cNvPicPr preferRelativeResize="0"/>
                   </pic:nvPicPr>
                   <pic:blipFill>
@@ -5366,7 +5365,7 @@
     <w:sdt>
       <w:sdtPr>
         <w:lock w:val="contentLocked"/>
-        <w:id w:val="29575310"/>
+        <w:id w:val="-924335772"/>
         <w:tag w:val="goog_rdk_0"/>
       </w:sdtPr>
       <w:sdtContent>
@@ -7174,7 +7173,7 @@
     <w:sdt>
       <w:sdtPr>
         <w:lock w:val="contentLocked"/>
-        <w:id w:val="1712817338"/>
+        <w:id w:val="1760914767"/>
         <w:tag w:val="goog_rdk_1"/>
       </w:sdtPr>
       <w:sdtContent>
@@ -7960,12 +7959,12 @@
             <wp:extent cx="5401000" cy="2066219"/>
             <wp:effectExtent b="0" l="0" r="0" t="0"/>
             <wp:wrapNone/>
-            <wp:docPr id="47" name="image43.png"/>
+            <wp:docPr id="49" name="image45.png"/>
             <a:graphic>
               <a:graphicData uri="http://schemas.openxmlformats.org/drawingml/2006/picture">
                 <pic:pic>
                   <pic:nvPicPr>
-                    <pic:cNvPr id="0" name="image43.png"/>
+                    <pic:cNvPr id="0" name="image45.png"/>
                     <pic:cNvPicPr preferRelativeResize="0"/>
                   </pic:nvPicPr>
                   <pic:blipFill>
@@ -8165,7 +8164,7 @@
             <wp:extent cx="5362115" cy="1590539"/>
             <wp:effectExtent b="0" l="0" r="0" t="0"/>
             <wp:wrapNone/>
-            <wp:docPr id="48" name="image42.png"/>
+            <wp:docPr id="50" name="image42.png"/>
             <a:graphic>
               <a:graphicData uri="http://schemas.openxmlformats.org/drawingml/2006/picture">
                 <pic:pic>
@@ -8352,12 +8351,12 @@
             <wp:extent cx="5362575" cy="3343275"/>
             <wp:effectExtent b="0" l="0" r="0" t="0"/>
             <wp:wrapNone/>
-            <wp:docPr id="19" name="image10.png"/>
+            <wp:docPr id="18" name="image14.png"/>
             <a:graphic>
               <a:graphicData uri="http://schemas.openxmlformats.org/drawingml/2006/picture">
                 <pic:pic>
                   <pic:nvPicPr>
-                    <pic:cNvPr id="0" name="image10.png"/>
+                    <pic:cNvPr id="0" name="image14.png"/>
                     <pic:cNvPicPr preferRelativeResize="0"/>
                   </pic:nvPicPr>
                   <pic:blipFill>
@@ -8576,12 +8575,12 @@
             <wp:extent cx="5448300" cy="1838680"/>
             <wp:effectExtent b="0" l="0" r="0" t="0"/>
             <wp:wrapNone/>
-            <wp:docPr id="49" name="image46.png"/>
+            <wp:docPr id="51" name="image49.png"/>
             <a:graphic>
               <a:graphicData uri="http://schemas.openxmlformats.org/drawingml/2006/picture">
                 <pic:pic>
                   <pic:nvPicPr>
-                    <pic:cNvPr id="0" name="image46.png"/>
+                    <pic:cNvPr id="0" name="image49.png"/>
                     <pic:cNvPicPr preferRelativeResize="0"/>
                   </pic:nvPicPr>
                   <pic:blipFill>
@@ -8804,12 +8803,12 @@
             <wp:extent cx="5448300" cy="1638300"/>
             <wp:effectExtent b="0" l="0" r="0" t="0"/>
             <wp:wrapNone/>
-            <wp:docPr id="40" name="image44.png"/>
+            <wp:docPr id="41" name="image34.png"/>
             <a:graphic>
               <a:graphicData uri="http://schemas.openxmlformats.org/drawingml/2006/picture">
                 <pic:pic>
                   <pic:nvPicPr>
-                    <pic:cNvPr id="0" name="image44.png"/>
+                    <pic:cNvPr id="0" name="image34.png"/>
                     <pic:cNvPicPr preferRelativeResize="0"/>
                   </pic:nvPicPr>
                   <pic:blipFill>
@@ -9017,12 +9016,12 @@
             <wp:extent cx="5401000" cy="1585703"/>
             <wp:effectExtent b="0" l="0" r="0" t="0"/>
             <wp:wrapNone/>
-            <wp:docPr id="1" name="image2.png"/>
+            <wp:docPr id="1" name="image1.png"/>
             <a:graphic>
               <a:graphicData uri="http://schemas.openxmlformats.org/drawingml/2006/picture">
                 <pic:pic>
                   <pic:nvPicPr>
-                    <pic:cNvPr id="0" name="image2.png"/>
+                    <pic:cNvPr id="0" name="image1.png"/>
                     <pic:cNvPicPr preferRelativeResize="0"/>
                   </pic:nvPicPr>
                   <pic:blipFill>
@@ -9260,12 +9259,12 @@
             <wp:extent cx="5401000" cy="2929886"/>
             <wp:effectExtent b="0" l="0" r="0" t="0"/>
             <wp:wrapNone/>
-            <wp:docPr id="3" name="image4.png"/>
+            <wp:docPr id="3" name="image3.png"/>
             <a:graphic>
               <a:graphicData uri="http://schemas.openxmlformats.org/drawingml/2006/picture">
                 <pic:pic>
                   <pic:nvPicPr>
-                    <pic:cNvPr id="0" name="image4.png"/>
+                    <pic:cNvPr id="0" name="image3.png"/>
                     <pic:cNvPicPr preferRelativeResize="0"/>
                   </pic:nvPicPr>
                   <pic:blipFill>
@@ -9474,12 +9473,12 @@
             <wp:extent cx="5400675" cy="2742042"/>
             <wp:effectExtent b="0" l="0" r="0" t="0"/>
             <wp:wrapNone/>
-            <wp:docPr id="4" name="image12.png"/>
+            <wp:docPr id="4" name="image8.png"/>
             <a:graphic>
               <a:graphicData uri="http://schemas.openxmlformats.org/drawingml/2006/picture">
                 <pic:pic>
                   <pic:nvPicPr>
-                    <pic:cNvPr id="0" name="image12.png"/>
+                    <pic:cNvPr id="0" name="image8.png"/>
                     <pic:cNvPicPr preferRelativeResize="0"/>
                   </pic:nvPicPr>
                   <pic:blipFill>
@@ -9922,12 +9921,12 @@
             <wp:extent cx="5278438" cy="1990725"/>
             <wp:effectExtent b="0" l="0" r="0" t="0"/>
             <wp:wrapNone/>
-            <wp:docPr id="31" name="image20.png"/>
+            <wp:docPr id="29" name="image19.png"/>
             <a:graphic>
               <a:graphicData uri="http://schemas.openxmlformats.org/drawingml/2006/picture">
                 <pic:pic>
                   <pic:nvPicPr>
-                    <pic:cNvPr id="0" name="image20.png"/>
+                    <pic:cNvPr id="0" name="image19.png"/>
                     <pic:cNvPicPr preferRelativeResize="0"/>
                   </pic:nvPicPr>
                   <pic:blipFill>
@@ -10178,12 +10177,12 @@
             <wp:extent cx="5381625" cy="3183350"/>
             <wp:effectExtent b="0" l="0" r="0" t="0"/>
             <wp:wrapNone/>
-            <wp:docPr id="18" name="image37.png"/>
+            <wp:docPr id="17" name="image15.png"/>
             <a:graphic>
               <a:graphicData uri="http://schemas.openxmlformats.org/drawingml/2006/picture">
                 <pic:pic>
                   <pic:nvPicPr>
-                    <pic:cNvPr id="0" name="image37.png"/>
+                    <pic:cNvPr id="0" name="image15.png"/>
                     <pic:cNvPicPr preferRelativeResize="0"/>
                   </pic:nvPicPr>
                   <pic:blipFill>
@@ -10436,12 +10435,12 @@
             <wp:extent cx="5381625" cy="2094582"/>
             <wp:effectExtent b="0" l="0" r="0" t="0"/>
             <wp:wrapNone/>
-            <wp:docPr id="35" name="image47.png"/>
+            <wp:docPr id="34" name="image41.png"/>
             <a:graphic>
               <a:graphicData uri="http://schemas.openxmlformats.org/drawingml/2006/picture">
                 <pic:pic>
                   <pic:nvPicPr>
-                    <pic:cNvPr id="0" name="image47.png"/>
+                    <pic:cNvPr id="0" name="image41.png"/>
                     <pic:cNvPicPr preferRelativeResize="0"/>
                   </pic:nvPicPr>
                   <pic:blipFill>
@@ -10650,12 +10649,12 @@
             <wp:extent cx="5381625" cy="2177536"/>
             <wp:effectExtent b="0" l="0" r="0" t="0"/>
             <wp:wrapNone/>
-            <wp:docPr id="15" name="image8.png"/>
+            <wp:docPr id="14" name="image7.png"/>
             <a:graphic>
               <a:graphicData uri="http://schemas.openxmlformats.org/drawingml/2006/picture">
                 <pic:pic>
                   <pic:nvPicPr>
-                    <pic:cNvPr id="0" name="image8.png"/>
+                    <pic:cNvPr id="0" name="image7.png"/>
                     <pic:cNvPicPr preferRelativeResize="0"/>
                   </pic:nvPicPr>
                   <pic:blipFill>
@@ -10845,12 +10844,12 @@
             <wp:extent cx="5381625" cy="1669444"/>
             <wp:effectExtent b="0" l="0" r="0" t="0"/>
             <wp:wrapNone/>
-            <wp:docPr id="7" name="image5.png"/>
+            <wp:docPr id="7" name="image22.png"/>
             <a:graphic>
               <a:graphicData uri="http://schemas.openxmlformats.org/drawingml/2006/picture">
                 <pic:pic>
                   <pic:nvPicPr>
-                    <pic:cNvPr id="0" name="image5.png"/>
+                    <pic:cNvPr id="0" name="image22.png"/>
                     <pic:cNvPicPr preferRelativeResize="0"/>
                   </pic:nvPicPr>
                   <pic:blipFill>
@@ -10993,12 +10992,12 @@
             <wp:extent cx="5381625" cy="2530090"/>
             <wp:effectExtent b="0" l="0" r="0" t="0"/>
             <wp:wrapNone/>
-            <wp:docPr id="25" name="image26.png"/>
+            <wp:docPr id="24" name="image24.png"/>
             <a:graphic>
               <a:graphicData uri="http://schemas.openxmlformats.org/drawingml/2006/picture">
                 <pic:pic>
                   <pic:nvPicPr>
-                    <pic:cNvPr id="0" name="image26.png"/>
+                    <pic:cNvPr id="0" name="image24.png"/>
                     <pic:cNvPicPr preferRelativeResize="0"/>
                   </pic:nvPicPr>
                   <pic:blipFill>
@@ -11177,12 +11176,12 @@
             <wp:extent cx="5401000" cy="1019236"/>
             <wp:effectExtent b="0" l="0" r="0" t="0"/>
             <wp:wrapNone/>
-            <wp:docPr id="41" name="image38.png"/>
+            <wp:docPr id="42" name="image52.png"/>
             <a:graphic>
               <a:graphicData uri="http://schemas.openxmlformats.org/drawingml/2006/picture">
                 <pic:pic>
                   <pic:nvPicPr>
-                    <pic:cNvPr id="0" name="image38.png"/>
+                    <pic:cNvPr id="0" name="image52.png"/>
                     <pic:cNvPicPr preferRelativeResize="0"/>
                   </pic:nvPicPr>
                   <pic:blipFill>
@@ -11305,12 +11304,12 @@
             <wp:extent cx="5400675" cy="2139166"/>
             <wp:effectExtent b="0" l="0" r="0" t="0"/>
             <wp:wrapNone/>
-            <wp:docPr id="45" name="image39.png"/>
+            <wp:docPr id="47" name="image30.png"/>
             <a:graphic>
               <a:graphicData uri="http://schemas.openxmlformats.org/drawingml/2006/picture">
                 <pic:pic>
                   <pic:nvPicPr>
-                    <pic:cNvPr id="0" name="image39.png"/>
+                    <pic:cNvPr id="0" name="image30.png"/>
                     <pic:cNvPicPr preferRelativeResize="0"/>
                   </pic:nvPicPr>
                   <pic:blipFill>
@@ -11460,12 +11459,12 @@
             <wp:extent cx="5400675" cy="1113434"/>
             <wp:effectExtent b="0" l="0" r="0" t="0"/>
             <wp:wrapNone/>
-            <wp:docPr id="12" name="image21.png"/>
+            <wp:docPr id="11" name="image18.png"/>
             <a:graphic>
               <a:graphicData uri="http://schemas.openxmlformats.org/drawingml/2006/picture">
                 <pic:pic>
                   <pic:nvPicPr>
-                    <pic:cNvPr id="0" name="image21.png"/>
+                    <pic:cNvPr id="0" name="image18.png"/>
                     <pic:cNvPicPr preferRelativeResize="0"/>
                   </pic:nvPicPr>
                   <pic:blipFill>
@@ -11632,12 +11631,12 @@
             <wp:extent cx="5401000" cy="3038713"/>
             <wp:effectExtent b="0" l="0" r="0" t="0"/>
             <wp:wrapNone/>
-            <wp:docPr id="51" name="image32.png"/>
+            <wp:docPr id="52" name="image40.png"/>
             <a:graphic>
               <a:graphicData uri="http://schemas.openxmlformats.org/drawingml/2006/picture">
                 <pic:pic>
                   <pic:nvPicPr>
-                    <pic:cNvPr id="0" name="image32.png"/>
+                    <pic:cNvPr id="0" name="image40.png"/>
                     <pic:cNvPicPr preferRelativeResize="0"/>
                   </pic:nvPicPr>
                   <pic:blipFill>
@@ -11917,12 +11916,12 @@
             <wp:extent cx="5401000" cy="1568032"/>
             <wp:effectExtent b="0" l="0" r="0" t="0"/>
             <wp:wrapNone/>
-            <wp:docPr id="26" name="image29.png"/>
+            <wp:docPr id="25" name="image21.png"/>
             <a:graphic>
               <a:graphicData uri="http://schemas.openxmlformats.org/drawingml/2006/picture">
                 <pic:pic>
                   <pic:nvPicPr>
-                    <pic:cNvPr id="0" name="image29.png"/>
+                    <pic:cNvPr id="0" name="image21.png"/>
                     <pic:cNvPicPr preferRelativeResize="0"/>
                   </pic:nvPicPr>
                   <pic:blipFill>
@@ -12130,12 +12129,12 @@
             <wp:extent cx="5401000" cy="546100"/>
             <wp:effectExtent b="0" l="0" r="0" t="0"/>
             <wp:wrapNone/>
-            <wp:docPr id="8" name="image1.png"/>
+            <wp:docPr id="8" name="image4.png"/>
             <a:graphic>
               <a:graphicData uri="http://schemas.openxmlformats.org/drawingml/2006/picture">
                 <pic:pic>
                   <pic:nvPicPr>
-                    <pic:cNvPr id="0" name="image1.png"/>
+                    <pic:cNvPr id="0" name="image4.png"/>
                     <pic:cNvPicPr preferRelativeResize="0"/>
                   </pic:nvPicPr>
                   <pic:blipFill>
@@ -12260,7 +12259,7 @@
         <w:rPr>
           <w:rtl w:val="0"/>
         </w:rPr>
-        <w:t xml:space="preserve">3.4.2.1 Pengujian App2</w:t>
+        <w:t xml:space="preserve">3.4.2.2 Pengujian App2</w:t>
       </w:r>
       <w:r>
         <w:drawing>
@@ -12275,12 +12274,12 @@
             <wp:extent cx="5401000" cy="736600"/>
             <wp:effectExtent b="0" l="0" r="0" t="0"/>
             <wp:wrapNone/>
-            <wp:docPr id="21" name="image31.png"/>
+            <wp:docPr id="20" name="image51.png"/>
             <a:graphic>
               <a:graphicData uri="http://schemas.openxmlformats.org/drawingml/2006/picture">
                 <pic:pic>
                   <pic:nvPicPr>
-                    <pic:cNvPr id="0" name="image31.png"/>
+                    <pic:cNvPr id="0" name="image51.png"/>
                     <pic:cNvPicPr preferRelativeResize="0"/>
                   </pic:nvPicPr>
                   <pic:blipFill>
@@ -12444,12 +12443,12 @@
           <wp:inline distB="114300" distT="114300" distL="114300" distR="114300">
             <wp:extent cx="5401000" cy="5499100"/>
             <wp:effectExtent b="0" l="0" r="0" t="0"/>
-            <wp:docPr id="33" name="image18.png"/>
+            <wp:docPr id="32" name="image23.png"/>
             <a:graphic>
               <a:graphicData uri="http://schemas.openxmlformats.org/drawingml/2006/picture">
                 <pic:pic>
                   <pic:nvPicPr>
-                    <pic:cNvPr id="0" name="image18.png"/>
+                    <pic:cNvPr id="0" name="image23.png"/>
                     <pic:cNvPicPr preferRelativeResize="0"/>
                   </pic:nvPicPr>
                   <pic:blipFill>
@@ -12598,7 +12597,7 @@
           <wp:inline distB="114300" distT="114300" distL="114300" distR="114300">
             <wp:extent cx="5401000" cy="2667000"/>
             <wp:effectExtent b="0" l="0" r="0" t="0"/>
-            <wp:docPr id="13" name="image9.png"/>
+            <wp:docPr id="12" name="image9.png"/>
             <a:graphic>
               <a:graphicData uri="http://schemas.openxmlformats.org/drawingml/2006/picture">
                 <pic:pic>
@@ -12714,12 +12713,12 @@
           <wp:inline distB="114300" distT="114300" distL="114300" distR="114300">
             <wp:extent cx="5401000" cy="2654300"/>
             <wp:effectExtent b="0" l="0" r="0" t="0"/>
-            <wp:docPr id="39" name="image36.png"/>
+            <wp:docPr id="40" name="image47.png"/>
             <a:graphic>
               <a:graphicData uri="http://schemas.openxmlformats.org/drawingml/2006/picture">
                 <pic:pic>
                   <pic:nvPicPr>
-                    <pic:cNvPr id="0" name="image36.png"/>
+                    <pic:cNvPr id="0" name="image47.png"/>
                     <pic:cNvPicPr preferRelativeResize="0"/>
                   </pic:nvPicPr>
                   <pic:blipFill>
@@ -12866,12 +12865,12 @@
           <wp:inline distB="114300" distT="114300" distL="114300" distR="114300">
             <wp:extent cx="5401000" cy="4889500"/>
             <wp:effectExtent b="0" l="0" r="0" t="0"/>
-            <wp:docPr id="36" name="image45.png"/>
+            <wp:docPr id="36" name="image31.png"/>
             <a:graphic>
               <a:graphicData uri="http://schemas.openxmlformats.org/drawingml/2006/picture">
                 <pic:pic>
                   <pic:nvPicPr>
-                    <pic:cNvPr id="0" name="image45.png"/>
+                    <pic:cNvPr id="0" name="image31.png"/>
                     <pic:cNvPicPr preferRelativeResize="0"/>
                   </pic:nvPicPr>
                   <pic:blipFill>
@@ -13023,12 +13022,12 @@
           <wp:inline distB="114300" distT="114300" distL="114300" distR="114300">
             <wp:extent cx="5401000" cy="4470400"/>
             <wp:effectExtent b="0" l="0" r="0" t="0"/>
-            <wp:docPr id="24" name="image27.png"/>
+            <wp:docPr id="23" name="image17.png"/>
             <a:graphic>
               <a:graphicData uri="http://schemas.openxmlformats.org/drawingml/2006/picture">
                 <pic:pic>
                   <pic:nvPicPr>
-                    <pic:cNvPr id="0" name="image27.png"/>
+                    <pic:cNvPr id="0" name="image17.png"/>
                     <pic:cNvPicPr preferRelativeResize="0"/>
                   </pic:nvPicPr>
                   <pic:blipFill>
@@ -13226,12 +13225,12 @@
           <wp:inline distB="114300" distT="114300" distL="114300" distR="114300">
             <wp:extent cx="5401000" cy="1016000"/>
             <wp:effectExtent b="0" l="0" r="0" t="0"/>
-            <wp:docPr id="43" name="image38.png"/>
+            <wp:docPr id="44" name="image52.png"/>
             <a:graphic>
               <a:graphicData uri="http://schemas.openxmlformats.org/drawingml/2006/picture">
                 <pic:pic>
                   <pic:nvPicPr>
-                    <pic:cNvPr id="0" name="image38.png"/>
+                    <pic:cNvPr id="0" name="image52.png"/>
                     <pic:cNvPicPr preferRelativeResize="0"/>
                   </pic:nvPicPr>
                   <pic:blipFill>
@@ -13345,12 +13344,12 @@
           <wp:inline distB="114300" distT="114300" distL="114300" distR="114300">
             <wp:extent cx="5401000" cy="2146300"/>
             <wp:effectExtent b="0" l="0" r="0" t="0"/>
-            <wp:docPr id="28" name="image39.png"/>
+            <wp:docPr id="27" name="image30.png"/>
             <a:graphic>
               <a:graphicData uri="http://schemas.openxmlformats.org/drawingml/2006/picture">
                 <pic:pic>
                   <pic:nvPicPr>
-                    <pic:cNvPr id="0" name="image39.png"/>
+                    <pic:cNvPr id="0" name="image30.png"/>
                     <pic:cNvPicPr preferRelativeResize="0"/>
                   </pic:nvPicPr>
                   <pic:blipFill>
@@ -13966,12 +13965,12 @@
           <wp:inline distB="114300" distT="114300" distL="114300" distR="114300">
             <wp:extent cx="5401000" cy="1612900"/>
             <wp:effectExtent b="0" l="0" r="0" t="0"/>
-            <wp:docPr id="30" name="image34.png"/>
+            <wp:docPr id="28" name="image20.png"/>
             <a:graphic>
               <a:graphicData uri="http://schemas.openxmlformats.org/drawingml/2006/picture">
                 <pic:pic>
                   <pic:nvPicPr>
-                    <pic:cNvPr id="0" name="image34.png"/>
+                    <pic:cNvPr id="0" name="image20.png"/>
                     <pic:cNvPicPr preferRelativeResize="0"/>
                   </pic:nvPicPr>
                   <pic:blipFill>
@@ -14085,12 +14084,12 @@
           <wp:inline distB="114300" distT="114300" distL="114300" distR="114300">
             <wp:extent cx="5401000" cy="2908300"/>
             <wp:effectExtent b="0" l="0" r="0" t="0"/>
-            <wp:docPr id="9" name="image7.png"/>
+            <wp:docPr id="9" name="image10.png"/>
             <a:graphic>
               <a:graphicData uri="http://schemas.openxmlformats.org/drawingml/2006/picture">
                 <pic:pic>
                   <pic:nvPicPr>
-                    <pic:cNvPr id="0" name="image7.png"/>
+                    <pic:cNvPr id="0" name="image10.png"/>
                     <pic:cNvPicPr preferRelativeResize="0"/>
                   </pic:nvPicPr>
                   <pic:blipFill>
@@ -14164,12 +14163,12 @@
           <wp:inline distB="114300" distT="114300" distL="114300" distR="114300">
             <wp:extent cx="5401000" cy="2298700"/>
             <wp:effectExtent b="0" l="0" r="0" t="0"/>
-            <wp:docPr id="52" name="image40.png"/>
+            <wp:docPr id="53" name="image46.png"/>
             <a:graphic>
               <a:graphicData uri="http://schemas.openxmlformats.org/drawingml/2006/picture">
                 <pic:pic>
                   <pic:nvPicPr>
-                    <pic:cNvPr id="0" name="image40.png"/>
+                    <pic:cNvPr id="0" name="image46.png"/>
                     <pic:cNvPicPr preferRelativeResize="0"/>
                   </pic:nvPicPr>
                   <pic:blipFill>
@@ -14432,12 +14431,12 @@
           <wp:inline distB="114300" distT="114300" distL="114300" distR="114300">
             <wp:extent cx="5401000" cy="1714500"/>
             <wp:effectExtent b="0" l="0" r="0" t="0"/>
-            <wp:docPr id="10" name="image11.png"/>
+            <wp:docPr id="10" name="image33.png"/>
             <a:graphic>
               <a:graphicData uri="http://schemas.openxmlformats.org/drawingml/2006/picture">
                 <pic:pic>
                   <pic:nvPicPr>
-                    <pic:cNvPr id="0" name="image11.png"/>
+                    <pic:cNvPr id="0" name="image33.png"/>
                     <pic:cNvPicPr preferRelativeResize="0"/>
                   </pic:nvPicPr>
                   <pic:blipFill>
@@ -14511,12 +14510,12 @@
           <wp:inline distB="114300" distT="114300" distL="114300" distR="114300">
             <wp:extent cx="5401000" cy="1765300"/>
             <wp:effectExtent b="0" l="0" r="0" t="0"/>
-            <wp:docPr id="20" name="image13.png"/>
+            <wp:docPr id="19" name="image6.png"/>
             <a:graphic>
               <a:graphicData uri="http://schemas.openxmlformats.org/drawingml/2006/picture">
                 <pic:pic>
                   <pic:nvPicPr>
-                    <pic:cNvPr id="0" name="image13.png"/>
+                    <pic:cNvPr id="0" name="image6.png"/>
                     <pic:cNvPicPr preferRelativeResize="0"/>
                   </pic:nvPicPr>
                   <pic:blipFill>
@@ -14658,12 +14657,12 @@
           <wp:inline distB="114300" distT="114300" distL="114300" distR="114300">
             <wp:extent cx="5401000" cy="825500"/>
             <wp:effectExtent b="0" l="0" r="0" t="0"/>
-            <wp:docPr id="6" name="image22.png"/>
+            <wp:docPr id="6" name="image13.png"/>
             <a:graphic>
               <a:graphicData uri="http://schemas.openxmlformats.org/drawingml/2006/picture">
                 <pic:pic>
                   <pic:nvPicPr>
-                    <pic:cNvPr id="0" name="image22.png"/>
+                    <pic:cNvPr id="0" name="image13.png"/>
                     <pic:cNvPicPr preferRelativeResize="0"/>
                   </pic:nvPicPr>
                   <pic:blipFill>
@@ -14802,12 +14801,12 @@
           <wp:inline distB="114300" distT="114300" distL="114300" distR="114300">
             <wp:extent cx="5401000" cy="2362200"/>
             <wp:effectExtent b="0" l="0" r="0" t="0"/>
-            <wp:docPr id="23" name="image17.png"/>
+            <wp:docPr id="22" name="image16.png"/>
             <a:graphic>
               <a:graphicData uri="http://schemas.openxmlformats.org/drawingml/2006/picture">
                 <pic:pic>
                   <pic:nvPicPr>
-                    <pic:cNvPr id="0" name="image17.png"/>
+                    <pic:cNvPr id="0" name="image16.png"/>
                     <pic:cNvPicPr preferRelativeResize="0"/>
                   </pic:nvPicPr>
                   <pic:blipFill>
@@ -14929,15 +14928,7 @@
         <w:rPr>
           <w:rtl w:val="0"/>
         </w:rPr>
-        <w:t xml:space="preserve">r DMZ yang dapat mengakses database. Pendekatan ini merupakan penerapan prinsip least privile</w:t>
-      </w:r>
-      <w:r>
-        <w:rPr>
-          <w:b w:val="1"/>
-          <w:bCs w:val="1"/>
-          <w:rtl w:val="0"/>
-        </w:rPr>
-        <w:t xml:space="preserve">ge</w:t>
+        <w:t xml:space="preserve">r DMZ yang dapat mengakses database. Pendekatan ini merupakan penerapan prinsip least privilege</w:t>
       </w:r>
       <w:r>
         <w:rPr>
@@ -14979,12 +14970,12 @@
           <wp:inline distB="114300" distT="114300" distL="114300" distR="114300">
             <wp:extent cx="5401000" cy="1536700"/>
             <wp:effectExtent b="0" l="0" r="0" t="0"/>
-            <wp:docPr id="17" name="image14.png"/>
+            <wp:docPr id="16" name="image5.png"/>
             <a:graphic>
               <a:graphicData uri="http://schemas.openxmlformats.org/drawingml/2006/picture">
                 <pic:pic>
                   <pic:nvPicPr>
-                    <pic:cNvPr id="0" name="image14.png"/>
+                    <pic:cNvPr id="0" name="image5.png"/>
                     <pic:cNvPicPr preferRelativeResize="0"/>
                   </pic:nvPicPr>
                   <pic:blipFill>
@@ -15058,12 +15049,12 @@
           <wp:inline distB="114300" distT="114300" distL="114300" distR="114300">
             <wp:extent cx="5401000" cy="736600"/>
             <wp:effectExtent b="0" l="0" r="0" t="0"/>
-            <wp:docPr id="42" name="image49.png"/>
+            <wp:docPr id="43" name="image35.png"/>
             <a:graphic>
               <a:graphicData uri="http://schemas.openxmlformats.org/drawingml/2006/picture">
                 <pic:pic>
                   <pic:nvPicPr>
-                    <pic:cNvPr id="0" name="image49.png"/>
+                    <pic:cNvPr id="0" name="image35.png"/>
                     <pic:cNvPicPr preferRelativeResize="0"/>
                   </pic:nvPicPr>
                   <pic:blipFill>
@@ -15137,12 +15128,12 @@
           <wp:inline distB="114300" distT="114300" distL="114300" distR="114300">
             <wp:extent cx="5401000" cy="825500"/>
             <wp:effectExtent b="0" l="0" r="0" t="0"/>
-            <wp:docPr id="5" name="image3.png"/>
+            <wp:docPr id="5" name="image2.png"/>
             <a:graphic>
               <a:graphicData uri="http://schemas.openxmlformats.org/drawingml/2006/picture">
                 <pic:pic>
                   <pic:nvPicPr>
-                    <pic:cNvPr id="0" name="image3.png"/>
+                    <pic:cNvPr id="0" name="image2.png"/>
                     <pic:cNvPicPr preferRelativeResize="0"/>
                   </pic:nvPicPr>
                   <pic:blipFill>
@@ -15344,12 +15335,12 @@
           <wp:inline distB="114300" distT="114300" distL="114300" distR="114300">
             <wp:extent cx="5401000" cy="3035300"/>
             <wp:effectExtent b="0" l="0" r="0" t="0"/>
-            <wp:docPr id="22" name="image24.png"/>
+            <wp:docPr id="21" name="image25.png"/>
             <a:graphic>
               <a:graphicData uri="http://schemas.openxmlformats.org/drawingml/2006/picture">
                 <pic:pic>
                   <pic:nvPicPr>
-                    <pic:cNvPr id="0" name="image24.png"/>
+                    <pic:cNvPr id="0" name="image25.png"/>
                     <pic:cNvPicPr preferRelativeResize="0"/>
                   </pic:nvPicPr>
                   <pic:blipFill>
@@ -15451,12 +15442,12 @@
           <wp:inline distB="114300" distT="114300" distL="114300" distR="114300">
             <wp:extent cx="5401000" cy="838200"/>
             <wp:effectExtent b="0" l="0" r="0" t="0"/>
-            <wp:docPr id="32" name="image33.png"/>
+            <wp:docPr id="31" name="image38.png"/>
             <a:graphic>
               <a:graphicData uri="http://schemas.openxmlformats.org/drawingml/2006/picture">
                 <pic:pic>
                   <pic:nvPicPr>
-                    <pic:cNvPr id="0" name="image33.png"/>
+                    <pic:cNvPr id="0" name="image38.png"/>
                     <pic:cNvPicPr preferRelativeResize="0"/>
                   </pic:nvPicPr>
                   <pic:blipFill>
@@ -15618,12 +15609,12 @@
           <wp:inline distB="114300" distT="114300" distL="114300" distR="114300">
             <wp:extent cx="5401000" cy="1282700"/>
             <wp:effectExtent b="0" l="0" r="0" t="0"/>
-            <wp:docPr id="34" name="image50.png"/>
+            <wp:docPr id="33" name="image29.png"/>
             <a:graphic>
               <a:graphicData uri="http://schemas.openxmlformats.org/drawingml/2006/picture">
                 <pic:pic>
                   <pic:nvPicPr>
-                    <pic:cNvPr id="0" name="image50.png"/>
+                    <pic:cNvPr id="0" name="image29.png"/>
                     <pic:cNvPicPr preferRelativeResize="0"/>
                   </pic:nvPicPr>
                   <pic:blipFill>
@@ -15892,12 +15883,12 @@
           <wp:inline distB="114300" distT="114300" distL="114300" distR="114300">
             <wp:extent cx="5401000" cy="698500"/>
             <wp:effectExtent b="0" l="0" r="0" t="0"/>
-            <wp:docPr id="16" name="image25.png"/>
+            <wp:docPr id="15" name="image12.png"/>
             <a:graphic>
               <a:graphicData uri="http://schemas.openxmlformats.org/drawingml/2006/picture">
                 <pic:pic>
                   <pic:nvPicPr>
-                    <pic:cNvPr id="0" name="image25.png"/>
+                    <pic:cNvPr id="0" name="image12.png"/>
                     <pic:cNvPicPr preferRelativeResize="0"/>
                   </pic:nvPicPr>
                   <pic:blipFill>
@@ -16023,12 +16014,12 @@
           <wp:inline distB="114300" distT="114300" distL="114300" distR="114300">
             <wp:extent cx="5401000" cy="3035300"/>
             <wp:effectExtent b="0" l="0" r="0" t="0"/>
-            <wp:docPr id="14" name="image6.png"/>
+            <wp:docPr id="13" name="image11.png"/>
             <a:graphic>
               <a:graphicData uri="http://schemas.openxmlformats.org/drawingml/2006/picture">
                 <pic:pic>
                   <pic:nvPicPr>
-                    <pic:cNvPr id="0" name="image6.png"/>
+                    <pic:cNvPr id="0" name="image11.png"/>
                     <pic:cNvPicPr preferRelativeResize="0"/>
                   </pic:nvPicPr>
                   <pic:blipFill>
@@ -16115,12 +16106,12 @@
           <wp:inline distB="114300" distT="114300" distL="114300" distR="114300">
             <wp:extent cx="5401000" cy="1892300"/>
             <wp:effectExtent b="0" l="0" r="0" t="0"/>
-            <wp:docPr id="27" name="image16.png"/>
+            <wp:docPr id="26" name="image32.png"/>
             <a:graphic>
               <a:graphicData uri="http://schemas.openxmlformats.org/drawingml/2006/picture">
                 <pic:pic>
                   <pic:nvPicPr>
-                    <pic:cNvPr id="0" name="image16.png"/>
+                    <pic:cNvPr id="0" name="image32.png"/>
                     <pic:cNvPicPr preferRelativeResize="0"/>
                   </pic:nvPicPr>
                   <pic:blipFill>
@@ -16194,12 +16185,12 @@
           <wp:inline distB="114300" distT="114300" distL="114300" distR="114300">
             <wp:extent cx="5401000" cy="660400"/>
             <wp:effectExtent b="0" l="0" r="0" t="0"/>
-            <wp:docPr id="44" name="image30.png"/>
+            <wp:docPr id="45" name="image44.png"/>
             <a:graphic>
               <a:graphicData uri="http://schemas.openxmlformats.org/drawingml/2006/picture">
                 <pic:pic>
                   <pic:nvPicPr>
-                    <pic:cNvPr id="0" name="image30.png"/>
+                    <pic:cNvPr id="0" name="image44.png"/>
                     <pic:cNvPicPr preferRelativeResize="0"/>
                   </pic:nvPicPr>
                   <pic:blipFill>
@@ -16273,12 +16264,12 @@
           <wp:inline distB="114300" distT="114300" distL="114300" distR="114300">
             <wp:extent cx="5401000" cy="444500"/>
             <wp:effectExtent b="0" l="0" r="0" t="0"/>
-            <wp:docPr id="2" name="image15.png"/>
+            <wp:docPr id="2" name="image48.png"/>
             <a:graphic>
               <a:graphicData uri="http://schemas.openxmlformats.org/drawingml/2006/picture">
                 <pic:pic>
                   <pic:nvPicPr>
-                    <pic:cNvPr id="0" name="image15.png"/>
+                    <pic:cNvPr id="0" name="image48.png"/>
                     <pic:cNvPicPr preferRelativeResize="0"/>
                   </pic:nvPicPr>
                   <pic:blipFill>
@@ -16352,12 +16343,12 @@
           <wp:inline distB="114300" distT="114300" distL="114300" distR="114300">
             <wp:extent cx="5401000" cy="1117600"/>
             <wp:effectExtent b="0" l="0" r="0" t="0"/>
-            <wp:docPr id="38" name="image48.png"/>
+            <wp:docPr id="38" name="image27.png"/>
             <a:graphic>
               <a:graphicData uri="http://schemas.openxmlformats.org/drawingml/2006/picture">
                 <pic:pic>
                   <pic:nvPicPr>
-                    <pic:cNvPr id="0" name="image48.png"/>
+                    <pic:cNvPr id="0" name="image27.png"/>
                     <pic:cNvPicPr preferRelativeResize="0"/>
                   </pic:nvPicPr>
                   <pic:blipFill>
@@ -16490,8 +16481,6 @@
     <w:p>
       <w:pPr>
         <w:pStyle w:val="Heading2"/>
-        <w:ind w:firstLine="0"/>
-        <w:jc w:val="left"/>
         <w:rPr/>
       </w:pPr>
       <w:bookmarkStart w:colFirst="0" w:colLast="0" w:name="_heading=h.2om7t7hqzgwz" w:id="68"/>
@@ -16520,20 +16509,12 @@
     <w:p>
       <w:pPr>
         <w:pStyle w:val="Heading3"/>
-        <w:keepNext w:val="0"/>
-        <w:keepLines w:val="0"/>
-        <w:spacing w:after="80" w:before="280" w:lineRule="auto"/>
-        <w:rPr>
-          <w:sz w:val="26"/>
-          <w:szCs w:val="26"/>
-        </w:rPr>
+        <w:rPr/>
       </w:pPr>
       <w:bookmarkStart w:colFirst="0" w:colLast="0" w:name="_heading=h.u537a7geeba1" w:id="69"/>
       <w:bookmarkEnd w:id="69"/>
       <w:r>
         <w:rPr>
-          <w:sz w:val="26"/>
-          <w:szCs w:val="26"/>
           <w:rtl w:val="0"/>
         </w:rPr>
         <w:t xml:space="preserve">4.1.1 Filter Rules (INPUT dan FORWARD)</w:t>
@@ -16784,23 +16765,27 @@
     </w:p>
     <w:p>
       <w:pPr>
-        <w:spacing w:after="80" w:line="312" w:lineRule="auto"/>
-        <w:ind w:left="720" w:firstLine="0"/>
+        <w:spacing w:line="276" w:lineRule="auto"/>
+        <w:ind w:firstLine="0"/>
         <w:jc w:val="center"/>
         <w:rPr/>
       </w:pPr>
       <w:r>
-        <w:rPr/>
+        <w:rPr>
+          <w:rFonts w:ascii="Arial" w:cs="Arial" w:eastAsia="Arial" w:hAnsi="Arial"/>
+          <w:sz w:val="22"/>
+          <w:szCs w:val="22"/>
+        </w:rPr>
         <w:drawing>
           <wp:inline distB="114300" distT="114300" distL="114300" distR="114300">
-            <wp:extent cx="4413694" cy="1618355"/>
+            <wp:extent cx="4964113" cy="3475754"/>
             <wp:effectExtent b="0" l="0" r="0" t="0"/>
-            <wp:docPr id="29" name="image23.png"/>
+            <wp:docPr id="30" name="image28.png"/>
             <a:graphic>
               <a:graphicData uri="http://schemas.openxmlformats.org/drawingml/2006/picture">
                 <pic:pic>
                   <pic:nvPicPr>
-                    <pic:cNvPr id="0" name="image23.png"/>
+                    <pic:cNvPr id="0" name="image28.png"/>
                     <pic:cNvPicPr preferRelativeResize="0"/>
                   </pic:nvPicPr>
                   <pic:blipFill>
@@ -16813,7 +16798,7 @@
                   <pic:spPr>
                     <a:xfrm>
                       <a:off x="0" y="0"/>
-                      <a:ext cx="4413694" cy="1618355"/>
+                      <a:ext cx="4964113" cy="3475754"/>
                     </a:xfrm>
                     <a:prstGeom prst="rect"/>
                     <a:ln/>
@@ -16846,23 +16831,27 @@
     </w:p>
     <w:p>
       <w:pPr>
-        <w:spacing w:after="80" w:before="200" w:line="312" w:lineRule="auto"/>
+        <w:spacing w:line="276" w:lineRule="auto"/>
         <w:ind w:firstLine="0"/>
         <w:jc w:val="center"/>
         <w:rPr/>
       </w:pPr>
       <w:r>
-        <w:rPr/>
+        <w:rPr>
+          <w:rFonts w:ascii="Arial" w:cs="Arial" w:eastAsia="Arial" w:hAnsi="Arial"/>
+          <w:sz w:val="22"/>
+          <w:szCs w:val="22"/>
+        </w:rPr>
         <w:drawing>
           <wp:inline distB="114300" distT="114300" distL="114300" distR="114300">
-            <wp:extent cx="5397500" cy="1612900"/>
+            <wp:extent cx="3611276" cy="7513638"/>
             <wp:effectExtent b="0" l="0" r="0" t="0"/>
-            <wp:docPr id="11" name="image19.gif"/>
+            <wp:docPr id="54" name="image50.png"/>
             <a:graphic>
               <a:graphicData uri="http://schemas.openxmlformats.org/drawingml/2006/picture">
                 <pic:pic>
                   <pic:nvPicPr>
-                    <pic:cNvPr id="0" name="image19.gif"/>
+                    <pic:cNvPr id="0" name="image50.png"/>
                     <pic:cNvPicPr preferRelativeResize="0"/>
                   </pic:nvPicPr>
                   <pic:blipFill>
@@ -16875,7 +16864,7 @@
                   <pic:spPr>
                     <a:xfrm>
                       <a:off x="0" y="0"/>
-                      <a:ext cx="5397500" cy="1612900"/>
+                      <a:ext cx="3611276" cy="7513638"/>
                     </a:xfrm>
                     <a:prstGeom prst="rect"/>
                     <a:ln/>
@@ -17020,23 +17009,27 @@
     </w:p>
     <w:p>
       <w:pPr>
-        <w:spacing w:after="80" w:before="200" w:lineRule="auto"/>
+        <w:spacing w:line="276" w:lineRule="auto"/>
         <w:ind w:firstLine="0"/>
         <w:jc w:val="center"/>
         <w:rPr/>
       </w:pPr>
       <w:r>
-        <w:rPr/>
+        <w:rPr>
+          <w:rFonts w:ascii="Arial" w:cs="Arial" w:eastAsia="Arial" w:hAnsi="Arial"/>
+          <w:sz w:val="22"/>
+          <w:szCs w:val="22"/>
+        </w:rPr>
         <w:drawing>
           <wp:inline distB="114300" distT="114300" distL="114300" distR="114300">
-            <wp:extent cx="5397500" cy="2197100"/>
+            <wp:extent cx="5400000" cy="2247900"/>
             <wp:effectExtent b="0" l="0" r="0" t="0"/>
-            <wp:docPr id="50" name="image35.gif"/>
+            <wp:docPr id="39" name="image37.png"/>
             <a:graphic>
               <a:graphicData uri="http://schemas.openxmlformats.org/drawingml/2006/picture">
                 <pic:pic>
                   <pic:nvPicPr>
-                    <pic:cNvPr id="0" name="image35.gif"/>
+                    <pic:cNvPr id="0" name="image37.png"/>
                     <pic:cNvPicPr preferRelativeResize="0"/>
                   </pic:nvPicPr>
                   <pic:blipFill>
@@ -17049,7 +17042,7 @@
                   <pic:spPr>
                     <a:xfrm>
                       <a:off x="0" y="0"/>
-                      <a:ext cx="5397500" cy="2197100"/>
+                      <a:ext cx="5400000" cy="2247900"/>
                     </a:xfrm>
                     <a:prstGeom prst="rect"/>
                     <a:ln/>
@@ -17088,20 +17081,12 @@
     <w:p>
       <w:pPr>
         <w:pStyle w:val="Heading3"/>
-        <w:keepNext w:val="0"/>
-        <w:keepLines w:val="0"/>
-        <w:spacing w:after="80" w:before="280" w:lineRule="auto"/>
-        <w:rPr>
-          <w:sz w:val="26"/>
-          <w:szCs w:val="26"/>
-        </w:rPr>
+        <w:rPr/>
       </w:pPr>
       <w:bookmarkStart w:colFirst="0" w:colLast="0" w:name="_heading=h.ts3inye4prxk" w:id="71"/>
       <w:bookmarkEnd w:id="71"/>
       <w:r>
         <w:rPr>
-          <w:sz w:val="26"/>
-          <w:szCs w:val="26"/>
           <w:rtl w:val="0"/>
         </w:rPr>
         <w:t xml:space="preserve">4.1.3 Address List Blocking</w:t>
@@ -17228,6 +17213,49 @@
         </w:rPr>
         <w:t xml:space="preserve">Semua alert yang dihasilkan oleh custom rules tercatat dalam format EVE JSON dan fast.log untuk analisis lebih lanjut. Total 102 alert berhasil terdeteksi selama periode pengujian, menunjukkan efektivitas rules dalam mendeteksi traffic mencurigakan.</w:t>
       </w:r>
+    </w:p>
+    <w:p>
+      <w:pPr>
+        <w:spacing w:after="200" w:lineRule="auto"/>
+        <w:ind w:firstLine="0"/>
+        <w:jc w:val="center"/>
+        <w:rPr/>
+      </w:pPr>
+      <w:r>
+        <w:rPr/>
+        <w:drawing>
+          <wp:inline distB="114300" distT="114300" distL="114300" distR="114300">
+            <wp:extent cx="3752850" cy="3521075"/>
+            <wp:effectExtent b="0" l="0" r="0" t="0"/>
+            <wp:docPr id="46" name="image39.png"/>
+            <a:graphic>
+              <a:graphicData uri="http://schemas.openxmlformats.org/drawingml/2006/picture">
+                <pic:pic>
+                  <pic:nvPicPr>
+                    <pic:cNvPr id="0" name="image39.png"/>
+                    <pic:cNvPicPr preferRelativeResize="0"/>
+                  </pic:nvPicPr>
+                  <pic:blipFill>
+                    <a:blip r:embed="rId61"/>
+                    <a:srcRect b="5937" l="0" r="0" t="0"/>
+                    <a:stretch>
+                      <a:fillRect/>
+                    </a:stretch>
+                  </pic:blipFill>
+                  <pic:spPr>
+                    <a:xfrm>
+                      <a:off x="0" y="0"/>
+                      <a:ext cx="3752850" cy="3521075"/>
+                    </a:xfrm>
+                    <a:prstGeom prst="rect"/>
+                    <a:ln/>
+                  </pic:spPr>
+                </pic:pic>
+              </a:graphicData>
+            </a:graphic>
+          </wp:inline>
+        </w:drawing>
+      </w:r>
       <w:r>
         <w:rPr>
           <w:rtl w:val="0"/>
@@ -17237,8 +17265,6 @@
     <w:p>
       <w:pPr>
         <w:pStyle w:val="Heading2"/>
-        <w:ind w:firstLine="0"/>
-        <w:jc w:val="left"/>
         <w:rPr/>
       </w:pPr>
       <w:bookmarkStart w:colFirst="0" w:colLast="0" w:name="_heading=h.x4e1qupwbkl6" w:id="73"/>
@@ -17253,22 +17279,12 @@
     <w:p>
       <w:pPr>
         <w:pStyle w:val="Heading3"/>
-        <w:keepNext w:val="0"/>
-        <w:keepLines w:val="0"/>
-        <w:spacing w:after="80" w:before="280" w:lineRule="auto"/>
-        <w:ind w:left="0" w:firstLine="0"/>
-        <w:jc w:val="both"/>
-        <w:rPr>
-          <w:sz w:val="26"/>
-          <w:szCs w:val="26"/>
-        </w:rPr>
+        <w:rPr/>
       </w:pPr>
       <w:bookmarkStart w:colFirst="0" w:colLast="0" w:name="_heading=h.7jqdgylqpfw7" w:id="74"/>
       <w:bookmarkEnd w:id="74"/>
       <w:r>
         <w:rPr>
-          <w:sz w:val="26"/>
-          <w:szCs w:val="26"/>
           <w:rtl w:val="0"/>
         </w:rPr>
         <w:t xml:space="preserve">4.3.1 Keamanan Database</w:t>
@@ -17386,27 +17402,15 @@
     <w:p>
       <w:pPr>
         <w:pStyle w:val="Heading3"/>
-        <w:keepNext w:val="0"/>
-        <w:keepLines w:val="0"/>
-        <w:spacing w:after="80" w:before="280" w:lineRule="auto"/>
-        <w:ind w:left="0" w:firstLine="0"/>
-        <w:jc w:val="both"/>
         <w:rPr/>
       </w:pPr>
       <w:bookmarkStart w:colFirst="0" w:colLast="0" w:name="_heading=h.btig5o9u5lg5" w:id="75"/>
       <w:bookmarkEnd w:id="75"/>
       <w:r>
         <w:rPr>
-          <w:sz w:val="26"/>
-          <w:szCs w:val="26"/>
           <w:rtl w:val="0"/>
         </w:rPr>
         <w:t xml:space="preserve">4.3.2 Keamanan Docker</w:t>
-      </w:r>
-      <w:r>
-        <w:rPr>
-          <w:rtl w:val="0"/>
-        </w:rPr>
       </w:r>
     </w:p>
     <w:p>
@@ -17500,13 +17504,57 @@
     </w:p>
     <w:p>
       <w:pPr>
-        <w:ind w:firstLine="0"/>
-        <w:jc w:val="left"/>
-        <w:rPr/>
-      </w:pPr>
-      <w:r>
-        <w:br w:type="page"/>
-      </w:r>
+        <w:spacing w:after="200" w:lineRule="auto"/>
+        <w:ind w:left="720" w:firstLine="0"/>
+        <w:rPr/>
+      </w:pPr>
+      <w:r>
+        <w:rPr/>
+        <w:drawing>
+          <wp:inline distB="114300" distT="114300" distL="114300" distR="114300">
+            <wp:extent cx="5114925" cy="2133600"/>
+            <wp:effectExtent b="0" l="0" r="0" t="0"/>
+            <wp:docPr id="35" name="image26.png"/>
+            <a:graphic>
+              <a:graphicData uri="http://schemas.openxmlformats.org/drawingml/2006/picture">
+                <pic:pic>
+                  <pic:nvPicPr>
+                    <pic:cNvPr id="0" name="image26.png"/>
+                    <pic:cNvPicPr preferRelativeResize="0"/>
+                  </pic:nvPicPr>
+                  <pic:blipFill>
+                    <a:blip r:embed="rId62"/>
+                    <a:srcRect b="0" l="0" r="0" t="0"/>
+                    <a:stretch>
+                      <a:fillRect/>
+                    </a:stretch>
+                  </pic:blipFill>
+                  <pic:spPr>
+                    <a:xfrm>
+                      <a:off x="0" y="0"/>
+                      <a:ext cx="5114925" cy="2133600"/>
+                    </a:xfrm>
+                    <a:prstGeom prst="rect"/>
+                    <a:ln/>
+                  </pic:spPr>
+                </pic:pic>
+              </a:graphicData>
+            </a:graphic>
+          </wp:inline>
+        </w:drawing>
+      </w:r>
+      <w:r>
+        <w:rPr>
+          <w:rtl w:val="0"/>
+        </w:rPr>
+      </w:r>
+    </w:p>
+    <w:p>
+      <w:pPr>
+        <w:spacing w:after="200" w:lineRule="auto"/>
+        <w:ind w:left="0" w:firstLine="0"/>
+        <w:rPr/>
+      </w:pPr>
       <w:r>
         <w:rPr>
           <w:rtl w:val="0"/>
@@ -17517,13 +17565,30 @@
       <w:pPr>
         <w:pStyle w:val="Heading1"/>
         <w:ind w:firstLine="0"/>
+        <w:rPr/>
+      </w:pPr>
+      <w:bookmarkStart w:colFirst="0" w:colLast="0" w:name="_heading=h.4vg20abtufiy" w:id="76"/>
+      <w:bookmarkEnd w:id="76"/>
+      <w:r>
+        <w:br w:type="page"/>
+      </w:r>
+      <w:r>
+        <w:rPr>
+          <w:rtl w:val="0"/>
+        </w:rPr>
+      </w:r>
+    </w:p>
+    <w:p>
+      <w:pPr>
+        <w:pStyle w:val="Heading1"/>
+        <w:ind w:firstLine="0"/>
         <w:rPr>
           <w:sz w:val="26"/>
           <w:szCs w:val="26"/>
         </w:rPr>
       </w:pPr>
-      <w:bookmarkStart w:colFirst="0" w:colLast="0" w:name="_heading=h.rus734x1yzt5" w:id="76"/>
-      <w:bookmarkEnd w:id="76"/>
+      <w:bookmarkStart w:colFirst="0" w:colLast="0" w:name="_heading=h.rus734x1yzt5" w:id="77"/>
+      <w:bookmarkEnd w:id="77"/>
       <w:r>
         <w:rPr>
           <w:rtl w:val="0"/>
@@ -17554,14 +17619,10 @@
     <w:p>
       <w:pPr>
         <w:pStyle w:val="Heading2"/>
-        <w:keepNext w:val="0"/>
-        <w:keepLines w:val="0"/>
-        <w:spacing w:after="80" w:before="360" w:lineRule="auto"/>
-        <w:jc w:val="both"/>
-        <w:rPr/>
-      </w:pPr>
-      <w:bookmarkStart w:colFirst="0" w:colLast="0" w:name="_heading=h.n761wrkrn7pw" w:id="77"/>
-      <w:bookmarkEnd w:id="77"/>
+        <w:rPr/>
+      </w:pPr>
+      <w:bookmarkStart w:colFirst="0" w:colLast="0" w:name="_heading=h.n761wrkrn7pw" w:id="78"/>
+      <w:bookmarkEnd w:id="78"/>
       <w:r>
         <w:rPr>
           <w:rtl w:val="0"/>
@@ -17585,14 +17646,10 @@
     <w:p>
       <w:pPr>
         <w:pStyle w:val="Heading3"/>
-        <w:keepNext w:val="0"/>
-        <w:keepLines w:val="0"/>
-        <w:spacing w:after="80" w:before="280" w:lineRule="auto"/>
-        <w:jc w:val="both"/>
-        <w:rPr/>
-      </w:pPr>
-      <w:bookmarkStart w:colFirst="0" w:colLast="0" w:name="_heading=h.jx65mm4rc8rb" w:id="78"/>
-      <w:bookmarkEnd w:id="78"/>
+        <w:rPr/>
+      </w:pPr>
+      <w:bookmarkStart w:colFirst="0" w:colLast="0" w:name="_heading=h.jx65mm4rc8rb" w:id="79"/>
+      <w:bookmarkEnd w:id="79"/>
       <w:r>
         <w:rPr>
           <w:rtl w:val="0"/>
@@ -18296,26 +18353,15 @@
     <w:p>
       <w:pPr>
         <w:pStyle w:val="Heading3"/>
-        <w:keepNext w:val="0"/>
-        <w:keepLines w:val="0"/>
-        <w:spacing w:after="80" w:before="280" w:lineRule="auto"/>
-        <w:jc w:val="left"/>
-        <w:rPr/>
-      </w:pPr>
-      <w:bookmarkStart w:colFirst="0" w:colLast="0" w:name="_heading=h.4i4qoewdft4y" w:id="79"/>
-      <w:bookmarkEnd w:id="79"/>
-      <w:r>
-        <w:rPr>
-          <w:sz w:val="26"/>
-          <w:szCs w:val="26"/>
+        <w:rPr/>
+      </w:pPr>
+      <w:bookmarkStart w:colFirst="0" w:colLast="0" w:name="_heading=h.4i4qoewdft4y" w:id="80"/>
+      <w:bookmarkEnd w:id="80"/>
+      <w:r>
+        <w:rPr>
           <w:rtl w:val="0"/>
         </w:rPr>
         <w:t xml:space="preserve">5.1.2 Firewall Rules MikroTik</w:t>
-      </w:r>
-      <w:r>
-        <w:rPr>
-          <w:rtl w:val="0"/>
-        </w:rPr>
       </w:r>
     </w:p>
     <w:tbl>
@@ -20050,25 +20096,15 @@
     <w:p>
       <w:pPr>
         <w:pStyle w:val="Heading3"/>
-        <w:keepNext w:val="0"/>
-        <w:keepLines w:val="0"/>
-        <w:spacing w:after="80" w:before="280" w:lineRule="auto"/>
-        <w:rPr/>
-      </w:pPr>
-      <w:bookmarkStart w:colFirst="0" w:colLast="0" w:name="_heading=h.67yu03j79qkf" w:id="80"/>
-      <w:bookmarkEnd w:id="80"/>
-      <w:r>
-        <w:rPr>
-          <w:sz w:val="26"/>
-          <w:szCs w:val="26"/>
+        <w:rPr/>
+      </w:pPr>
+      <w:bookmarkStart w:colFirst="0" w:colLast="0" w:name="_heading=h.67yu03j79qkf" w:id="81"/>
+      <w:bookmarkEnd w:id="81"/>
+      <w:r>
+        <w:rPr>
           <w:rtl w:val="0"/>
         </w:rPr>
         <w:t xml:space="preserve">5.1.3 VM Ubuntu DMZ</w:t>
-      </w:r>
-      <w:r>
-        <w:rPr>
-          <w:rtl w:val="0"/>
-        </w:rPr>
       </w:r>
     </w:p>
     <w:tbl>
@@ -22453,8 +22489,8 @@
         <w:spacing w:after="80" w:before="280" w:lineRule="auto"/>
         <w:rPr/>
       </w:pPr>
-      <w:bookmarkStart w:colFirst="0" w:colLast="0" w:name="_heading=h.wa6buenakyka" w:id="81"/>
-      <w:bookmarkEnd w:id="81"/>
+      <w:bookmarkStart w:colFirst="0" w:colLast="0" w:name="_heading=h.wa6buenakyka" w:id="82"/>
+      <w:bookmarkEnd w:id="82"/>
       <w:r>
         <w:rPr>
           <w:sz w:val="26"/>
@@ -23432,8 +23468,8 @@
         <w:spacing w:after="80" w:before="360" w:lineRule="auto"/>
         <w:rPr/>
       </w:pPr>
-      <w:bookmarkStart w:colFirst="0" w:colLast="0" w:name="_heading=h.a8c99v22bubj" w:id="82"/>
-      <w:bookmarkEnd w:id="82"/>
+      <w:bookmarkStart w:colFirst="0" w:colLast="0" w:name="_heading=h.a8c99v22bubj" w:id="83"/>
+      <w:bookmarkEnd w:id="83"/>
       <w:r>
         <w:rPr>
           <w:rtl w:val="0"/>
@@ -25569,20 +25605,12 @@
     <w:p>
       <w:pPr>
         <w:pStyle w:val="Heading3"/>
-        <w:keepNext w:val="0"/>
-        <w:keepLines w:val="0"/>
-        <w:spacing w:after="80" w:before="280" w:lineRule="auto"/>
-        <w:rPr>
-          <w:sz w:val="26"/>
-          <w:szCs w:val="26"/>
-        </w:rPr>
-      </w:pPr>
-      <w:bookmarkStart w:colFirst="0" w:colLast="0" w:name="_heading=h.tlx68m3aq4xm" w:id="83"/>
-      <w:bookmarkEnd w:id="83"/>
-      <w:r>
-        <w:rPr>
-          <w:sz w:val="26"/>
-          <w:szCs w:val="26"/>
+        <w:rPr/>
+      </w:pPr>
+      <w:bookmarkStart w:colFirst="0" w:colLast="0" w:name="_heading=h.tlx68m3aq4xm" w:id="84"/>
+      <w:bookmarkEnd w:id="84"/>
+      <w:r>
+        <w:rPr>
           <w:rtl w:val="0"/>
         </w:rPr>
         <w:t xml:space="preserve">5.2.1 Analisis Hasil Pengujian</w:t>
@@ -25706,8 +25734,8 @@
         <w:ind w:firstLine="0"/>
         <w:rPr/>
       </w:pPr>
-      <w:bookmarkStart w:colFirst="0" w:colLast="0" w:name="_heading=h.jtx9j5wfz0o2" w:id="84"/>
-      <w:bookmarkEnd w:id="84"/>
+      <w:bookmarkStart w:colFirst="0" w:colLast="0" w:name="_heading=h.jtx9j5wfz0o2" w:id="85"/>
+      <w:bookmarkEnd w:id="85"/>
       <w:r>
         <w:rPr>
           <w:rtl w:val="0"/>
@@ -25727,7 +25755,7 @@
         <w:rPr>
           <w:rtl w:val="0"/>
         </w:rPr>
-        <w:t xml:space="preserve">Selama proses implementasi, beberapa kendala teknis dihadapi oleh tim. Berikut adalah dokumentasi kendala yang dihadapi beserta solusi yang diterapkan:</w:t>
+        <w:t xml:space="preserve">Selama proses implementasi, beberapa kendala teknis dihadapi oleh tim. Berikut adalah dokumentasi kendala yang dihadapi serta solusi yang diterapkan:</w:t>
       </w:r>
       <w:r>
         <w:rPr>
@@ -26696,8 +26724,8 @@
         <w:ind w:firstLine="0"/>
         <w:rPr/>
       </w:pPr>
-      <w:bookmarkStart w:colFirst="0" w:colLast="0" w:name="_heading=h.xsjh59dupcuu" w:id="85"/>
-      <w:bookmarkEnd w:id="85"/>
+      <w:bookmarkStart w:colFirst="0" w:colLast="0" w:name="_heading=h.xsjh59dupcuu" w:id="86"/>
+      <w:bookmarkEnd w:id="86"/>
       <w:r>
         <w:br w:type="page"/>
       </w:r>
@@ -26713,8 +26741,8 @@
         <w:ind w:firstLine="0"/>
         <w:rPr/>
       </w:pPr>
-      <w:bookmarkStart w:colFirst="0" w:colLast="0" w:name="_heading=h.r5g4guucl774" w:id="86"/>
-      <w:bookmarkEnd w:id="86"/>
+      <w:bookmarkStart w:colFirst="0" w:colLast="0" w:name="_heading=h.r5g4guucl774" w:id="87"/>
+      <w:bookmarkEnd w:id="87"/>
       <w:r>
         <w:rPr>
           <w:rtl w:val="0"/>
@@ -26734,8 +26762,8 @@
         <w:pStyle w:val="Heading2"/>
         <w:rPr/>
       </w:pPr>
-      <w:bookmarkStart w:colFirst="0" w:colLast="0" w:name="_heading=h.lvgzogr1za7t" w:id="87"/>
-      <w:bookmarkEnd w:id="87"/>
+      <w:bookmarkStart w:colFirst="0" w:colLast="0" w:name="_heading=h.lvgzogr1za7t" w:id="88"/>
+      <w:bookmarkEnd w:id="88"/>
       <w:r>
         <w:rPr>
           <w:rtl w:val="0"/>
@@ -26801,7 +26829,7 @@
         <w:rPr>
           <w:rtl w:val="0"/>
         </w:rPr>
-        <w:t xml:space="preserve">Dua aplikasi web dengan stack teknologi berbeda (Python/Flask dan PHP/Apache) berhasil di-deploy dalam container Docker dan terintegrasi dengan database MySQL di segmen LAN melalui koneksi yang aman.</w:t>
+        <w:t xml:space="preserve">Dua aplikasi web dengan stack teknologi berbeda (Python/Flask dan Node.js) berhasil di-deploy dalam container Docker dan terintegrasi dengan database MySQL di segmen LAN melalui koneksi yang aman.</w:t>
       </w:r>
     </w:p>
     <w:p>
@@ -26862,8 +26890,8 @@
         <w:pStyle w:val="Heading2"/>
         <w:rPr/>
       </w:pPr>
-      <w:bookmarkStart w:colFirst="0" w:colLast="0" w:name="_heading=h.tzy3012ur6xb" w:id="88"/>
-      <w:bookmarkEnd w:id="88"/>
+      <w:bookmarkStart w:colFirst="0" w:colLast="0" w:name="_heading=h.tzy3012ur6xb" w:id="89"/>
+      <w:bookmarkEnd w:id="89"/>
       <w:r>
         <w:rPr>
           <w:rtl w:val="0"/>
@@ -27015,8 +27043,8 @@
         <w:ind w:firstLine="0"/>
         <w:rPr/>
       </w:pPr>
-      <w:bookmarkStart w:colFirst="0" w:colLast="0" w:name="_heading=h.qdjbfq3t4onc" w:id="89"/>
-      <w:bookmarkEnd w:id="89"/>
+      <w:bookmarkStart w:colFirst="0" w:colLast="0" w:name="_heading=h.qdjbfq3t4onc" w:id="90"/>
+      <w:bookmarkEnd w:id="90"/>
       <w:r>
         <w:rPr>
           <w:rtl w:val="0"/>
@@ -27034,8 +27062,22 @@
           <w:rtl w:val="0"/>
         </w:rPr>
         <w:t xml:space="preserve">Link Drive : </w:t>
-        <w:br w:type="textWrapping"/>
-        <w:t xml:space="preserve">Link Github : </w:t>
+      </w:r>
+      <w:hyperlink r:id="rId63">
+        <w:r>
+          <w:rPr>
+            <w:color w:val="1155cc"/>
+            <w:u w:val="single"/>
+            <w:rtl w:val="0"/>
+          </w:rPr>
+          <w:t xml:space="preserve">Drive </w:t>
+        </w:r>
+      </w:hyperlink>
+      <w:r>
+        <w:rPr>
+          <w:rtl w:val="0"/>
+        </w:rPr>
+        <w:t xml:space="preserve"> </w:t>
       </w:r>
     </w:p>
     <w:p>
@@ -27048,6 +27090,22 @@
           <w:rtl w:val="0"/>
         </w:rPr>
         <w:t xml:space="preserve">Link Video Presentasi : </w:t>
+      </w:r>
+      <w:hyperlink r:id="rId64">
+        <w:r>
+          <w:rPr>
+            <w:color w:val="1155cc"/>
+            <w:u w:val="single"/>
+            <w:rtl w:val="0"/>
+          </w:rPr>
+          <w:t xml:space="preserve">Video Presentasi</w:t>
+        </w:r>
+      </w:hyperlink>
+      <w:r>
+        <w:rPr>
+          <w:rtl w:val="0"/>
+        </w:rPr>
+        <w:t xml:space="preserve"> </w:t>
       </w:r>
     </w:p>
     <w:p>
@@ -29796,7 +29854,7 @@
 
 <file path=customXML/item1.xml><?xml version="1.0" encoding="utf-8"?>
 <go:gDocsCustomXmlDataStorage xmlns:go="http://customooxmlschemas.google.com/" xmlns:r="http://schemas.openxmlformats.org/officeDocument/2006/relationships" uri="GoogleDocsCustomDataVersion2">
-  <go:docsCustomData xmlns:go="http://customooxmlschemas.google.com/" roundtripDataSignature="AMtx7mhhvpLI7+bHQVxdpZC+yWa9XX+m+Q==">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</go:docsCustomData>
+  <go:docsCustomData xmlns:go="http://customooxmlschemas.google.com/" roundtripDataSignature="AMtx7mhFsU/oVthUZFRS/O0+Z/zLmfYRFA==">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</go:docsCustomData>
 </go:gDocsCustomXmlDataStorage>
 </file>
 

</xml_diff>